<commit_message>
Modified Internal Team Notes
</commit_message>
<xml_diff>
--- a/Internal Team Notes.docx
+++ b/Internal Team Notes.docx
@@ -67,7 +67,13 @@
         <w:rPr>
           <w:lang w:val="en-US"/>
         </w:rPr>
-        <w:t xml:space="preserve">Priavte </w:t>
+        <w:t>Private</w:t>
+      </w:r>
+      <w:r>
+        <w:rPr>
+          <w:lang w:val="en-US"/>
+        </w:rPr>
+        <w:t xml:space="preserve"> </w:t>
       </w:r>
       <w:r>
         <w:rPr>
@@ -79,7 +85,21 @@
         <w:rPr>
           <w:lang w:val="en-US"/>
         </w:rPr>
-        <w:t xml:space="preserve"> (Only private for now due to our internal notes, once we are finished with the entire assignment we can delete internal notes document and make the Repo public)</w:t>
+        <w:t xml:space="preserve"> (Only private for now due to our internal notes, once we are finished with the entire </w:t>
+      </w:r>
+      <w:proofErr w:type="gramStart"/>
+      <w:r>
+        <w:rPr>
+          <w:lang w:val="en-US"/>
+        </w:rPr>
+        <w:t>assignment</w:t>
+      </w:r>
+      <w:proofErr w:type="gramEnd"/>
+      <w:r>
+        <w:rPr>
+          <w:lang w:val="en-US"/>
+        </w:rPr>
+        <w:t xml:space="preserve"> we can delete internal notes document and make the Repo public)</w:t>
       </w:r>
     </w:p>
     <w:p>
@@ -96,7 +116,21 @@
         <w:rPr>
           <w:lang w:val="en-US"/>
         </w:rPr>
-        <w:t>Added README (Quick descr, feel free to modify however you please)</w:t>
+        <w:t xml:space="preserve">Added README (Quick </w:t>
+      </w:r>
+      <w:proofErr w:type="spellStart"/>
+      <w:r>
+        <w:rPr>
+          <w:lang w:val="en-US"/>
+        </w:rPr>
+        <w:t>descr</w:t>
+      </w:r>
+      <w:proofErr w:type="spellEnd"/>
+      <w:r>
+        <w:rPr>
+          <w:lang w:val="en-US"/>
+        </w:rPr>
+        <w:t>, feel free to modify however you please)</w:t>
       </w:r>
     </w:p>
     <w:p>
@@ -113,7 +147,21 @@
         <w:rPr>
           <w:lang w:val="en-US"/>
         </w:rPr>
-        <w:t>Added .gitignore file for Python</w:t>
+        <w:t>Added .</w:t>
+      </w:r>
+      <w:proofErr w:type="spellStart"/>
+      <w:r>
+        <w:rPr>
+          <w:lang w:val="en-US"/>
+        </w:rPr>
+        <w:t>gitignore</w:t>
+      </w:r>
+      <w:proofErr w:type="spellEnd"/>
+      <w:r>
+        <w:rPr>
+          <w:lang w:val="en-US"/>
+        </w:rPr>
+        <w:t xml:space="preserve"> file for Python</w:t>
       </w:r>
     </w:p>
     <w:p>
@@ -156,48 +204,20 @@
           <w:lang w:val="en-US"/>
         </w:rPr>
       </w:pPr>
-      <w:r>
-        <w:rPr>
-          <w:lang w:val="en-US"/>
-        </w:rPr>
-        <w:t>GitIgnore later updated to exclude any temporary files (beginning with ~$)</w:t>
-      </w:r>
-    </w:p>
-    <w:p>
-      <w:pPr>
-        <w:numPr>
-          <w:ilvl w:val="0"/>
-          <w:numId w:val="2"/>
-        </w:numPr>
-        <w:rPr>
-          <w:lang w:val="en-US"/>
-        </w:rPr>
-      </w:pPr>
-      <w:r>
-        <w:rPr>
-          <w:lang w:val="en-US"/>
-        </w:rPr>
-        <w:t>Also updated GitIgnore to exclude 'Internal Team Notes', this is to be used by us so that we can</w:t>
-      </w:r>
-      <w:r>
-        <w:rPr>
-          <w:lang w:val="en-US"/>
-        </w:rPr>
-        <w:t xml:space="preserve"> l</w:t>
-      </w:r>
-      <w:r>
-        <w:rPr>
-          <w:lang w:val="en-US"/>
-        </w:rPr>
-        <w:t>eave notes for each other or perhaps to do etc.</w:t>
-      </w:r>
-    </w:p>
-    <w:p>
-      <w:pPr>
-        <w:rPr>
-          <w:lang w:val="en-US"/>
-        </w:rPr>
-      </w:pPr>
+      <w:proofErr w:type="spellStart"/>
+      <w:r>
+        <w:rPr>
+          <w:lang w:val="en-US"/>
+        </w:rPr>
+        <w:t>GitIgnore</w:t>
+      </w:r>
+      <w:proofErr w:type="spellEnd"/>
+      <w:r>
+        <w:rPr>
+          <w:lang w:val="en-US"/>
+        </w:rPr>
+        <w:t xml:space="preserve"> later updated to exclude any temporary files (beginning with ~$)</w:t>
+      </w:r>
     </w:p>
     <w:sectPr>
       <w:pgSz w:w="11906" w:h="16838"/>

</xml_diff>

<commit_message>
Added main doc internal structure_Updated Internal Team Notes
</commit_message>
<xml_diff>
--- a/Internal Team Notes.docx
+++ b/Internal Team Notes.docx
@@ -218,6 +218,198 @@
         </w:rPr>
         <w:t xml:space="preserve"> later updated to exclude any temporary files (beginning with ~$)</w:t>
       </w:r>
+    </w:p>
+    <w:p>
+      <w:pPr>
+        <w:rPr>
+          <w:lang w:val="en-US"/>
+        </w:rPr>
+      </w:pPr>
+    </w:p>
+    <w:p>
+      <w:pPr>
+        <w:rPr>
+          <w:b/>
+          <w:bCs/>
+          <w:sz w:val="32"/>
+          <w:szCs w:val="32"/>
+          <w:lang w:val="en-US"/>
+        </w:rPr>
+      </w:pPr>
+      <w:r>
+        <w:rPr>
+          <w:b/>
+          <w:bCs/>
+          <w:sz w:val="32"/>
+          <w:szCs w:val="32"/>
+          <w:lang w:val="en-US"/>
+        </w:rPr>
+        <w:t>2</w:t>
+      </w:r>
+      <w:r>
+        <w:rPr>
+          <w:b/>
+          <w:bCs/>
+          <w:sz w:val="32"/>
+          <w:szCs w:val="32"/>
+          <w:lang w:val="en-US"/>
+        </w:rPr>
+        <w:t>2</w:t>
+      </w:r>
+      <w:r>
+        <w:rPr>
+          <w:b/>
+          <w:bCs/>
+          <w:sz w:val="32"/>
+          <w:szCs w:val="32"/>
+          <w:lang w:val="en-US"/>
+        </w:rPr>
+        <w:t>/11/2025</w:t>
+      </w:r>
+      <w:r>
+        <w:rPr>
+          <w:b/>
+          <w:bCs/>
+          <w:sz w:val="32"/>
+          <w:szCs w:val="32"/>
+          <w:lang w:val="en-US"/>
+        </w:rPr>
+        <w:t xml:space="preserve"> – Luca Alfino</w:t>
+      </w:r>
+    </w:p>
+    <w:p>
+      <w:pPr>
+        <w:rPr>
+          <w:b/>
+          <w:bCs/>
+          <w:sz w:val="32"/>
+          <w:szCs w:val="32"/>
+          <w:lang w:val="en-US"/>
+        </w:rPr>
+      </w:pPr>
+      <w:r>
+        <w:rPr>
+          <w:lang w:val="en-US"/>
+        </w:rPr>
+        <w:t xml:space="preserve">Updated </w:t>
+      </w:r>
+      <w:proofErr w:type="spellStart"/>
+      <w:r>
+        <w:rPr>
+          <w:lang w:val="en-US"/>
+        </w:rPr>
+        <w:t>gitIgnore</w:t>
+      </w:r>
+      <w:proofErr w:type="spellEnd"/>
+      <w:r>
+        <w:rPr>
+          <w:lang w:val="en-US"/>
+        </w:rPr>
+        <w:t xml:space="preserve"> with more temp files</w:t>
+      </w:r>
+    </w:p>
+    <w:p>
+      <w:pPr>
+        <w:rPr>
+          <w:lang w:val="en-US"/>
+        </w:rPr>
+      </w:pPr>
+      <w:r>
+        <w:rPr>
+          <w:lang w:val="en-US"/>
+        </w:rPr>
+        <w:t>Filled up Main Document with the structure</w:t>
+      </w:r>
+    </w:p>
+    <w:p>
+      <w:pPr>
+        <w:rPr>
+          <w:lang w:val="en-US"/>
+        </w:rPr>
+      </w:pPr>
+      <w:r>
+        <w:rPr>
+          <w:lang w:val="en-US"/>
+        </w:rPr>
+        <w:t xml:space="preserve">Will be mostly working on the data part at this point, as for the second part of Data – Luke Cardona to add the EDA </w:t>
+      </w:r>
+      <w:r>
+        <w:rPr>
+          <w:lang w:val="en-US"/>
+        </w:rPr>
+        <w:t xml:space="preserve">&amp; Task Justification </w:t>
+      </w:r>
+      <w:r>
+        <w:rPr>
+          <w:lang w:val="en-US"/>
+        </w:rPr>
+        <w:t>part of it</w:t>
+      </w:r>
+      <w:r>
+        <w:rPr>
+          <w:lang w:val="en-US"/>
+        </w:rPr>
+        <w:t xml:space="preserve"> in second notebook</w:t>
+      </w:r>
+      <w:r>
+        <w:rPr>
+          <w:lang w:val="en-US"/>
+        </w:rPr>
+        <w:t>:</w:t>
+      </w:r>
+      <w:r>
+        <w:rPr>
+          <w:lang w:val="en-US"/>
+        </w:rPr>
+        <w:br/>
+      </w:r>
+      <w:r>
+        <w:rPr>
+          <w:lang w:val="en-US"/>
+        </w:rPr>
+        <w:drawing>
+          <wp:inline distT="0" distB="0" distL="0" distR="0" wp14:anchorId="4016DAFF" wp14:editId="5CFADBCE">
+            <wp:extent cx="5581650" cy="4229100"/>
+            <wp:effectExtent l="0" t="0" r="0" b="0"/>
+            <wp:docPr id="1093482457" name="Picture 1" descr="A document with text and words&#10;&#10;AI-generated content may be incorrect."/>
+            <wp:cNvGraphicFramePr>
+              <a:graphicFrameLocks xmlns:a="http://schemas.openxmlformats.org/drawingml/2006/main" noChangeAspect="1"/>
+            </wp:cNvGraphicFramePr>
+            <a:graphic xmlns:a="http://schemas.openxmlformats.org/drawingml/2006/main">
+              <a:graphicData uri="http://schemas.openxmlformats.org/drawingml/2006/picture">
+                <pic:pic xmlns:pic="http://schemas.openxmlformats.org/drawingml/2006/picture">
+                  <pic:nvPicPr>
+                    <pic:cNvPr id="1093482457" name="Picture 1" descr="A document with text and words&#10;&#10;AI-generated content may be incorrect."/>
+                    <pic:cNvPicPr/>
+                  </pic:nvPicPr>
+                  <pic:blipFill>
+                    <a:blip r:embed="rId5"/>
+                    <a:stretch>
+                      <a:fillRect/>
+                    </a:stretch>
+                  </pic:blipFill>
+                  <pic:spPr>
+                    <a:xfrm>
+                      <a:off x="0" y="0"/>
+                      <a:ext cx="5615077" cy="4254427"/>
+                    </a:xfrm>
+                    <a:prstGeom prst="rect">
+                      <a:avLst/>
+                    </a:prstGeom>
+                  </pic:spPr>
+                </pic:pic>
+              </a:graphicData>
+            </a:graphic>
+          </wp:inline>
+        </w:drawing>
+      </w:r>
+    </w:p>
+    <w:p>
+      <w:pPr>
+        <w:rPr>
+          <w:lang w:val="en-US"/>
+        </w:rPr>
+      </w:pPr>
     </w:p>
     <w:sectPr>
       <w:pgSz w:w="11906" w:h="16838"/>
@@ -1144,6 +1336,7 @@
   <w:style w:type="character" w:default="1" w:styleId="DefaultParagraphFont">
     <w:name w:val="Default Paragraph Font"/>
     <w:uiPriority w:val="1"/>
+    <w:semiHidden/>
     <w:unhideWhenUsed/>
   </w:style>
   <w:style w:type="table" w:default="1" w:styleId="TableNormal">

</xml_diff>